<commit_message>
OutputJob + bissle Doku
</commit_message>
<xml_diff>
--- a/D_Documentation/Alex/Benutzerhandbuch.docx
+++ b/D_Documentation/Alex/Benutzerhandbuch.docx
@@ -15,6 +15,7 @@
           <w:bCs/>
           <w:sz w:val="52"/>
           <w:szCs w:val="48"/>
+          <w:lang w:val="en-GB"/>
         </w:rPr>
       </w:pPr>
       <w:r>
@@ -23,9 +24,22 @@
           <w:bCs/>
           <w:sz w:val="52"/>
           <w:szCs w:val="48"/>
+          <w:lang w:val="en-GB"/>
         </w:rPr>
-        <w:t>3D Scanner Benutzerhandbuch</w:t>
+        <w:t xml:space="preserve">3D Scanner </w:t>
       </w:r>
+      <w:proofErr w:type="spellStart"/>
+      <w:r>
+        <w:rPr>
+          <w:b/>
+          <w:bCs/>
+          <w:sz w:val="52"/>
+          <w:szCs w:val="48"/>
+          <w:lang w:val="en-GB"/>
+        </w:rPr>
+        <w:t>Benutzerhandbuch</w:t>
+      </w:r>
+      <w:proofErr w:type="spellEnd"/>
     </w:p>
     <w:p>
       <w:pPr>
@@ -35,6 +49,7 @@
           <w:bCs/>
           <w:sz w:val="48"/>
           <w:szCs w:val="44"/>
+          <w:lang w:val="en-GB"/>
         </w:rPr>
       </w:pPr>
     </w:p>
@@ -46,6 +61,7 @@
           <w:bCs/>
           <w:sz w:val="48"/>
           <w:szCs w:val="44"/>
+          <w:lang w:val="en-GB"/>
         </w:rPr>
       </w:pPr>
     </w:p>
@@ -57,6 +73,7 @@
           <w:bCs/>
           <w:sz w:val="48"/>
           <w:szCs w:val="44"/>
+          <w:lang w:val="en-GB"/>
         </w:rPr>
       </w:pPr>
     </w:p>
@@ -68,6 +85,7 @@
           <w:bCs/>
           <w:sz w:val="48"/>
           <w:szCs w:val="44"/>
+          <w:lang w:val="en-GB"/>
         </w:rPr>
       </w:pPr>
     </w:p>
@@ -79,6 +97,7 @@
           <w:bCs/>
           <w:sz w:val="48"/>
           <w:szCs w:val="44"/>
+          <w:lang w:val="en-GB"/>
         </w:rPr>
       </w:pPr>
     </w:p>
@@ -90,6 +109,7 @@
           <w:bCs/>
           <w:sz w:val="48"/>
           <w:szCs w:val="44"/>
+          <w:lang w:val="en-GB"/>
         </w:rPr>
       </w:pPr>
     </w:p>
@@ -101,6 +121,7 @@
           <w:bCs/>
           <w:sz w:val="48"/>
           <w:szCs w:val="44"/>
+          <w:lang w:val="en-GB"/>
         </w:rPr>
       </w:pPr>
     </w:p>
@@ -112,6 +133,7 @@
           <w:bCs/>
           <w:sz w:val="48"/>
           <w:szCs w:val="44"/>
+          <w:lang w:val="en-GB"/>
         </w:rPr>
       </w:pPr>
     </w:p>
@@ -123,6 +145,7 @@
           <w:bCs/>
           <w:sz w:val="48"/>
           <w:szCs w:val="44"/>
+          <w:lang w:val="en-GB"/>
         </w:rPr>
       </w:pPr>
     </w:p>
@@ -134,6 +157,7 @@
           <w:bCs/>
           <w:sz w:val="48"/>
           <w:szCs w:val="44"/>
+          <w:lang w:val="en-GB"/>
         </w:rPr>
       </w:pPr>
     </w:p>
@@ -145,6 +169,7 @@
           <w:bCs/>
           <w:sz w:val="48"/>
           <w:szCs w:val="44"/>
+          <w:lang w:val="en-GB"/>
         </w:rPr>
       </w:pPr>
     </w:p>
@@ -156,6 +181,7 @@
           <w:bCs/>
           <w:sz w:val="48"/>
           <w:szCs w:val="44"/>
+          <w:lang w:val="en-GB"/>
         </w:rPr>
       </w:pPr>
     </w:p>
@@ -167,6 +193,7 @@
           <w:bCs/>
           <w:sz w:val="48"/>
           <w:szCs w:val="44"/>
+          <w:lang w:val="en-GB"/>
         </w:rPr>
       </w:pPr>
     </w:p>
@@ -178,6 +205,7 @@
           <w:bCs/>
           <w:sz w:val="48"/>
           <w:szCs w:val="44"/>
+          <w:lang w:val="en-GB"/>
         </w:rPr>
       </w:pPr>
     </w:p>
@@ -189,6 +217,7 @@
           <w:bCs/>
           <w:sz w:val="48"/>
           <w:szCs w:val="44"/>
+          <w:lang w:val="en-GB"/>
         </w:rPr>
       </w:pPr>
     </w:p>
@@ -200,6 +229,7 @@
           <w:bCs/>
           <w:sz w:val="48"/>
           <w:szCs w:val="44"/>
+          <w:lang w:val="en-GB"/>
         </w:rPr>
       </w:pPr>
     </w:p>
@@ -211,11 +241,20 @@
           <w:bCs/>
           <w:sz w:val="48"/>
           <w:szCs w:val="44"/>
+          <w:lang w:val="en-GB"/>
         </w:rPr>
       </w:pPr>
     </w:p>
     <w:sdt>
       <w:sdtPr>
+        <w:rPr>
+          <w:rFonts w:eastAsiaTheme="minorHAnsi" w:cstheme="minorBidi"/>
+          <w:b w:val="0"/>
+          <w:color w:val="auto"/>
+          <w:sz w:val="24"/>
+          <w:szCs w:val="22"/>
+          <w:lang w:eastAsia="en-US"/>
+        </w:rPr>
         <w:id w:val="1194423827"/>
         <w:docPartObj>
           <w:docPartGallery w:val="Table of Contents"/>
@@ -224,29 +263,38 @@
       </w:sdtPr>
       <w:sdtEndPr>
         <w:rPr>
-          <w:rFonts w:eastAsiaTheme="minorHAnsi" w:cstheme="minorBidi"/>
           <w:bCs/>
           <w:noProof/>
-          <w:color w:val="auto"/>
-          <w:sz w:val="24"/>
-          <w:szCs w:val="22"/>
-          <w:lang w:eastAsia="en-US"/>
         </w:rPr>
       </w:sdtEndPr>
       <w:sdtContent>
         <w:p>
           <w:pPr>
             <w:pStyle w:val="TOCHeading"/>
+            <w:rPr>
+              <w:lang w:val="en-GB"/>
+            </w:rPr>
           </w:pPr>
           <w:r>
+            <w:rPr>
+              <w:lang w:val="en-GB"/>
+            </w:rPr>
             <w:t>Contents</w:t>
           </w:r>
         </w:p>
         <w:p>
+          <w:pPr>
+            <w:rPr>
+              <w:lang w:val="en-GB"/>
+            </w:rPr>
+          </w:pPr>
           <w:r>
             <w:fldChar w:fldCharType="begin"/>
           </w:r>
           <w:r>
+            <w:rPr>
+              <w:lang w:val="en-GB"/>
+            </w:rPr>
             <w:instrText xml:space="preserve"> TOC \o "1-3" \h \z \u </w:instrText>
           </w:r>
           <w:r>
@@ -257,6 +305,7 @@
               <w:b/>
               <w:bCs/>
               <w:noProof/>
+              <w:lang w:val="en-GB"/>
             </w:rPr>
             <w:t>No table of contents entries found.</w:t>
           </w:r>
@@ -272,7 +321,15 @@
       </w:sdtContent>
     </w:sdt>
     <w:p>
+      <w:pPr>
+        <w:rPr>
+          <w:lang w:val="en-GB"/>
+        </w:rPr>
+      </w:pPr>
       <w:r>
+        <w:rPr>
+          <w:lang w:val="en-GB"/>
+        </w:rPr>
         <w:br w:type="page"/>
       </w:r>
     </w:p>
@@ -298,7 +355,13 @@
     </w:p>
     <w:p>
       <w:r>
-        <w:t>Verbinden Sie den Schuko-Stecker mit dem Strom Netz und warten Sie kurz ab, es dauert etwas bis sich die Hardware hochgefahren hat.</w:t>
+        <w:t xml:space="preserve">Verbinden Sie den Schuko-Stecker mit dem Strom Netz und warten Sie kurz ab, es dauert </w:t>
+      </w:r>
+      <w:r>
+        <w:t>etwas,</w:t>
+      </w:r>
+      <w:r>
+        <w:t xml:space="preserve"> bis sich die Hardware hochgefahren hat.</w:t>
       </w:r>
     </w:p>
     <w:p/>
@@ -315,7 +378,15 @@
         <w:jc w:val="both"/>
       </w:pPr>
       <w:r>
-        <w:t>Stecken Sie nun auf der gegenüberliegenden Seite der Stromversorgung das Ethernet Kabel an ihr Endgerät (Laptop) und öffnen Sie das Programm TigerVNC. Geben Sie dort nun wie folgt folgende Adresse ein:</w:t>
+        <w:t xml:space="preserve">Stecken Sie nun auf der gegenüberliegenden Seite der Stromversorgung das Ethernet Kabel an ihr Endgerät (Laptop) und öffnen Sie das Programm </w:t>
+      </w:r>
+      <w:proofErr w:type="spellStart"/>
+      <w:r>
+        <w:t>TigerVNC</w:t>
+      </w:r>
+      <w:proofErr w:type="spellEnd"/>
+      <w:r>
+        <w:t>. Geben Sie dort nun wie folgt folgende Adresse ein:</w:t>
       </w:r>
     </w:p>
     <w:p>
@@ -365,7 +436,13 @@
         <w:jc w:val="both"/>
       </w:pPr>
       <w:r>
-        <w:t xml:space="preserve">Öffnen Sie das Programm namens 3D-Scanner GUI welches jetzt auf dem virtuellen Dekstop sichtbar sein sollte. </w:t>
+        <w:t xml:space="preserve">Öffnen Sie das Programm namens 3D-Scanner GUI welches jetzt auf dem virtuellen </w:t>
+      </w:r>
+      <w:r>
+        <w:t>Desktop</w:t>
+      </w:r>
+      <w:r>
+        <w:t xml:space="preserve"> sichtbar sein sollte. </w:t>
       </w:r>
     </w:p>
     <w:p>
@@ -393,8 +470,13 @@
       <w:pPr>
         <w:jc w:val="both"/>
       </w:pPr>
+      <w:proofErr w:type="gramStart"/>
       <w:r>
-        <w:t>!Bitte Türe jetzt schließen!</w:t>
+        <w:t>!Bitte</w:t>
+      </w:r>
+      <w:proofErr w:type="gramEnd"/>
+      <w:r>
+        <w:t xml:space="preserve"> Türe jetzt schließen!</w:t>
       </w:r>
     </w:p>
     <w:p>
@@ -644,7 +726,15 @@
       <w:jc w:val="center"/>
     </w:pPr>
     <w:r>
-      <w:t>Wurde für Sie bereitgestellt von Schiechtl Alexander und Granegger Felix</w:t>
+      <w:t xml:space="preserve">Wurde für Sie bereitgestellt von Schiechtl Alexander und </w:t>
+    </w:r>
+    <w:proofErr w:type="spellStart"/>
+    <w:r>
+      <w:t>Granegger</w:t>
+    </w:r>
+    <w:proofErr w:type="spellEnd"/>
+    <w:r>
+      <w:t xml:space="preserve"> Felix</w:t>
     </w:r>
   </w:p>
   <w:p>

</xml_diff>